<commit_message>
feat: create stress testing report, not detected 503, added scripts
</commit_message>
<xml_diff>
--- a/Lab4/lab4.docx
+++ b/Lab4/lab4.docx
@@ -1771,12 +1771,6 @@
         <w:gridCol w:w="4500"/>
       </w:tblGrid>
       <w:tr>
-        <w:tblPrEx>
-          <w:tblCellMar>
-            <w:top w:w="0" w:type="dxa"/>
-            <w:bottom w:w="0" w:type="dxa"/>
-          </w:tblCellMar>
-        </w:tblPrEx>
         <w:tc>
           <w:tcPr>
             <w:tcW w:w="4500" w:type="dxa"/>
@@ -1829,12 +1823,6 @@
         </w:tc>
       </w:tr>
       <w:tr>
-        <w:tblPrEx>
-          <w:tblCellMar>
-            <w:top w:w="0" w:type="dxa"/>
-            <w:bottom w:w="0" w:type="dxa"/>
-          </w:tblCellMar>
-        </w:tblPrEx>
         <w:tc>
           <w:tcPr>
             <w:tcW w:w="4500" w:type="dxa"/>
@@ -1877,12 +1865,6 @@
         </w:tc>
       </w:tr>
       <w:tr>
-        <w:tblPrEx>
-          <w:tblCellMar>
-            <w:top w:w="0" w:type="dxa"/>
-            <w:bottom w:w="0" w:type="dxa"/>
-          </w:tblCellMar>
-        </w:tblPrEx>
         <w:tc>
           <w:tcPr>
             <w:tcW w:w="4500" w:type="dxa"/>
@@ -1925,12 +1907,6 @@
         </w:tc>
       </w:tr>
       <w:tr>
-        <w:tblPrEx>
-          <w:tblCellMar>
-            <w:top w:w="0" w:type="dxa"/>
-            <w:bottom w:w="0" w:type="dxa"/>
-          </w:tblCellMar>
-        </w:tblPrEx>
         <w:tc>
           <w:tcPr>
             <w:tcW w:w="4500" w:type="dxa"/>
@@ -1973,12 +1949,6 @@
         </w:tc>
       </w:tr>
       <w:tr>
-        <w:tblPrEx>
-          <w:tblCellMar>
-            <w:top w:w="0" w:type="dxa"/>
-            <w:bottom w:w="0" w:type="dxa"/>
-          </w:tblCellMar>
-        </w:tblPrEx>
         <w:tc>
           <w:tcPr>
             <w:tcW w:w="4500" w:type="dxa"/>
@@ -2023,12 +1993,6 @@
         </w:tc>
       </w:tr>
       <w:tr>
-        <w:tblPrEx>
-          <w:tblCellMar>
-            <w:top w:w="0" w:type="dxa"/>
-            <w:bottom w:w="0" w:type="dxa"/>
-          </w:tblCellMar>
-        </w:tblPrEx>
         <w:tc>
           <w:tcPr>
             <w:tcW w:w="4500" w:type="dxa"/>
@@ -2555,6 +2519,7 @@
         <w:rPr>
           <w:rFonts w:ascii="Times New Roman" w:hAnsi="Times New Roman" w:cs="Times New Roman"/>
           <w:sz w:val="24"/>
+          <w:lang w:val="ru-RU"/>
         </w:rPr>
       </w:pPr>
       <w:r>
@@ -2565,53 +2530,13 @@
         </w:rPr>
         <w:t xml:space="preserve">Проверяет время отклика сервера: запрос считается неуспешным, если пороговое время выполнения превышено. </w:t>
       </w:r>
-      <w:proofErr w:type="spellStart"/>
-      <w:r>
-        <w:rPr>
-          <w:rFonts w:ascii="Times New Roman" w:hAnsi="Times New Roman" w:cs="Times New Roman"/>
-          <w:sz w:val="24"/>
-        </w:rPr>
-        <w:t>Для</w:t>
-      </w:r>
-      <w:proofErr w:type="spellEnd"/>
-      <w:r>
-        <w:rPr>
-          <w:rFonts w:ascii="Times New Roman" w:hAnsi="Times New Roman" w:cs="Times New Roman"/>
-          <w:sz w:val="24"/>
-        </w:rPr>
-        <w:t xml:space="preserve"> </w:t>
-      </w:r>
-      <w:proofErr w:type="spellStart"/>
-      <w:r>
-        <w:rPr>
-          <w:rFonts w:ascii="Times New Roman" w:hAnsi="Times New Roman" w:cs="Times New Roman"/>
-          <w:sz w:val="24"/>
-        </w:rPr>
-        <w:t>варианта</w:t>
-      </w:r>
-      <w:proofErr w:type="spellEnd"/>
-      <w:r>
-        <w:rPr>
-          <w:rFonts w:ascii="Times New Roman" w:hAnsi="Times New Roman" w:cs="Times New Roman"/>
-          <w:sz w:val="24"/>
-        </w:rPr>
-        <w:t xml:space="preserve"> — 600 </w:t>
-      </w:r>
-      <w:proofErr w:type="spellStart"/>
-      <w:r>
-        <w:rPr>
-          <w:rFonts w:ascii="Times New Roman" w:hAnsi="Times New Roman" w:cs="Times New Roman"/>
-          <w:sz w:val="24"/>
-        </w:rPr>
-        <w:t>мс</w:t>
-      </w:r>
-      <w:proofErr w:type="spellEnd"/>
-      <w:r>
-        <w:rPr>
-          <w:rFonts w:ascii="Times New Roman" w:hAnsi="Times New Roman" w:cs="Times New Roman"/>
-          <w:sz w:val="24"/>
-        </w:rPr>
-        <w:t>.</w:t>
+      <w:r>
+        <w:rPr>
+          <w:rFonts w:ascii="Times New Roman" w:hAnsi="Times New Roman" w:cs="Times New Roman"/>
+          <w:sz w:val="24"/>
+          <w:lang w:val="ru-RU"/>
+        </w:rPr>
+        <w:t>Для варианта — 600 мс.</w:t>
       </w:r>
     </w:p>
     <w:p>
@@ -2620,6 +2545,7 @@
         <w:rPr>
           <w:rFonts w:ascii="Times New Roman" w:hAnsi="Times New Roman" w:cs="Times New Roman"/>
           <w:sz w:val="24"/>
+          <w:lang w:val="ru-RU"/>
         </w:rPr>
       </w:pPr>
       <w:r>
@@ -2670,7 +2596,45 @@
           <w:bCs/>
           <w:sz w:val="24"/>
         </w:rPr>
-        <w:t>Constant Throughput Timer</w:t>
+        <w:t>Constant</w:t>
+      </w:r>
+      <w:r>
+        <w:rPr>
+          <w:rFonts w:ascii="Times New Roman" w:hAnsi="Times New Roman" w:cs="Times New Roman"/>
+          <w:b/>
+          <w:bCs/>
+          <w:sz w:val="24"/>
+          <w:lang w:val="ru-RU"/>
+        </w:rPr>
+        <w:t xml:space="preserve"> </w:t>
+      </w:r>
+      <w:r>
+        <w:rPr>
+          <w:rFonts w:ascii="Times New Roman" w:hAnsi="Times New Roman" w:cs="Times New Roman"/>
+          <w:b/>
+          <w:bCs/>
+          <w:sz w:val="24"/>
+        </w:rPr>
+        <w:t>Throughput</w:t>
+      </w:r>
+      <w:r>
+        <w:rPr>
+          <w:rFonts w:ascii="Times New Roman" w:hAnsi="Times New Roman" w:cs="Times New Roman"/>
+          <w:b/>
+          <w:bCs/>
+          <w:sz w:val="24"/>
+          <w:lang w:val="ru-RU"/>
+        </w:rPr>
+        <w:t xml:space="preserve"> </w:t>
+      </w:r>
+      <w:r>
+        <w:rPr>
+          <w:rFonts w:ascii="Times New Roman" w:hAnsi="Times New Roman" w:cs="Times New Roman"/>
+          <w:b/>
+          <w:bCs/>
+          <w:sz w:val="24"/>
+        </w:rPr>
+        <w:t>Timer</w:t>
       </w:r>
     </w:p>
     <w:p>
@@ -3298,23 +3262,7 @@
           <w:sz w:val="24"/>
           <w:lang w:val="ru-RU"/>
         </w:rPr>
-        <w:t xml:space="preserve">Конфигурация </w:t>
-      </w:r>
-      <w:r>
-        <w:rPr>
-          <w:rFonts w:ascii="Times New Roman" w:hAnsi="Times New Roman" w:cs="Times New Roman"/>
-          <w:sz w:val="24"/>
-          <w:lang w:val="ru-RU"/>
-        </w:rPr>
-        <w:t>2</w:t>
-      </w:r>
-      <w:r>
-        <w:rPr>
-          <w:rFonts w:ascii="Times New Roman" w:hAnsi="Times New Roman" w:cs="Times New Roman"/>
-          <w:sz w:val="24"/>
-          <w:lang w:val="ru-RU"/>
-        </w:rPr>
-        <w:t>:</w:t>
+        <w:t>Конфигурация 2:</w:t>
       </w:r>
     </w:p>
     <w:p>
@@ -3386,23 +3334,7 @@
           <w:lang w:val="ru-RU"/>
         </w:rPr>
         <w:lastRenderedPageBreak/>
-        <w:t xml:space="preserve">Конфигурация </w:t>
-      </w:r>
-      <w:r>
-        <w:rPr>
-          <w:rFonts w:ascii="Times New Roman" w:hAnsi="Times New Roman" w:cs="Times New Roman"/>
-          <w:sz w:val="24"/>
-          <w:lang w:val="ru-RU"/>
-        </w:rPr>
-        <w:t>3</w:t>
-      </w:r>
-      <w:r>
-        <w:rPr>
-          <w:rFonts w:ascii="Times New Roman" w:hAnsi="Times New Roman" w:cs="Times New Roman"/>
-          <w:sz w:val="24"/>
-          <w:lang w:val="ru-RU"/>
-        </w:rPr>
-        <w:t>:</w:t>
+        <w:t>Конфигурация 3:</w:t>
       </w:r>
     </w:p>
     <w:p>
@@ -4113,519 +4045,39 @@
     </w:p>
     <w:p>
       <w:pPr>
-        <w:rPr>
-          <w:rFonts w:ascii="Times New Roman" w:hAnsi="Times New Roman" w:cs="Times New Roman"/>
-          <w:sz w:val="24"/>
-          <w:lang w:val="ru-RU"/>
-        </w:rPr>
-      </w:pPr>
-      <w:r>
-        <w:rPr>
-          <w:rFonts w:ascii="Times New Roman" w:hAnsi="Times New Roman" w:cs="Times New Roman"/>
-          <w:sz w:val="24"/>
-          <w:lang w:val="ru-RU"/>
-        </w:rPr>
-        <w:t>Резкий скачок нагрузки: рост до 300 пользователей за 60 секунд (по 5 пользователей в секунду), удерж</w:t>
-      </w:r>
+        <w:pStyle w:val="Heading2"/>
+        <w:spacing w:before="280" w:after="160"/>
+        <w:rPr>
+          <w:rFonts w:ascii="Times New Roman" w:eastAsiaTheme="minorHAnsi" w:hAnsi="Times New Roman" w:cs="Times New Roman"/>
+          <w:color w:val="auto"/>
+          <w:sz w:val="24"/>
+          <w:szCs w:val="22"/>
+          <w:lang w:val="ru-RU"/>
+        </w:rPr>
+      </w:pPr>
+      <w:r>
+        <w:rPr>
+          <w:rFonts w:ascii="Times New Roman" w:eastAsiaTheme="minorHAnsi" w:hAnsi="Times New Roman" w:cs="Times New Roman"/>
+          <w:color w:val="auto"/>
+          <w:sz w:val="24"/>
+          <w:szCs w:val="22"/>
+          <w:lang w:val="ru-RU"/>
+        </w:rPr>
+        <w:t>В ходе стресс-тестирования HTTP 503 не был зафиксирован вплоть до 224 пользователей. Однако уже при нагрузке 32 пользователя (640 запросов/мин) среднее время ответа превысило 620 мс (621 мс), а доля ошибок достигла 49%. При нагрузке 40 пользователей (800 запросов/мин) среднее время ответа составило 660 мс, а доля ошибок — 91%. Это свидетельствует о превышении предельной нагрузки. Сервер возвращал ошибки, отличные от 503 (вероятно, HTTP 500 или таймауты), что может быть связано с особенностями конфигурации приложения</w:t>
+      </w:r>
+    </w:p>
+    <w:p>
+      <w:pPr>
+        <w:pStyle w:val="Heading2"/>
+        <w:spacing w:before="280" w:after="160"/>
+        <w:rPr>
+          <w:rFonts w:ascii="Times New Roman" w:hAnsi="Times New Roman" w:cs="Times New Roman"/>
+          <w:sz w:val="36"/>
+          <w:lang w:val="ru-RU"/>
+        </w:rPr>
+      </w:pPr>
       <w:bookmarkStart w:id="0" w:name="_GoBack"/>
       <w:bookmarkEnd w:id="0"/>
-      <w:r>
-        <w:rPr>
-          <w:rFonts w:ascii="Times New Roman" w:hAnsi="Times New Roman" w:cs="Times New Roman"/>
-          <w:sz w:val="24"/>
-          <w:lang w:val="ru-RU"/>
-        </w:rPr>
-        <w:t xml:space="preserve">ание 180 секунд. </w:t>
-      </w:r>
-      <w:r>
-        <w:rPr>
-          <w:rFonts w:ascii="Times New Roman" w:hAnsi="Times New Roman" w:cs="Times New Roman"/>
-          <w:sz w:val="24"/>
-        </w:rPr>
-        <w:t>Duration</w:t>
-      </w:r>
-      <w:r>
-        <w:rPr>
-          <w:rFonts w:ascii="Times New Roman" w:hAnsi="Times New Roman" w:cs="Times New Roman"/>
-          <w:sz w:val="24"/>
-          <w:lang w:val="ru-RU"/>
-        </w:rPr>
-        <w:t xml:space="preserve"> </w:t>
-      </w:r>
-      <w:r>
-        <w:rPr>
-          <w:rFonts w:ascii="Times New Roman" w:hAnsi="Times New Roman" w:cs="Times New Roman"/>
-          <w:sz w:val="24"/>
-        </w:rPr>
-        <w:t>Assertion</w:t>
-      </w:r>
-      <w:r>
-        <w:rPr>
-          <w:rFonts w:ascii="Times New Roman" w:hAnsi="Times New Roman" w:cs="Times New Roman"/>
-          <w:sz w:val="24"/>
-          <w:lang w:val="ru-RU"/>
-        </w:rPr>
-        <w:t xml:space="preserve"> в этом эксперименте отключён, чтобы не засорять данные искусственными падениями по ассертам — фиксируются только реальные ошибки сервера (500/503/нет ответа).</w:t>
-      </w:r>
-    </w:p>
-    <w:p>
-      <w:pPr>
-        <w:spacing w:after="200"/>
-        <w:rPr>
-          <w:rFonts w:ascii="Times New Roman" w:hAnsi="Times New Roman" w:cs="Times New Roman"/>
-          <w:sz w:val="24"/>
-          <w:lang w:val="ru-RU"/>
-        </w:rPr>
-      </w:pPr>
-      <w:r>
-        <w:rPr>
-          <w:rFonts w:ascii="Times New Roman" w:hAnsi="Times New Roman" w:cs="Times New Roman"/>
-          <w:i/>
-          <w:iCs/>
-          <w:color w:val="C00000"/>
-          <w:sz w:val="24"/>
-          <w:lang w:val="ru-RU"/>
-        </w:rPr>
-        <w:t xml:space="preserve">[ЗАПОЛНИТЬ: скриншот вкладки </w:t>
-      </w:r>
-      <w:r>
-        <w:rPr>
-          <w:rFonts w:ascii="Times New Roman" w:hAnsi="Times New Roman" w:cs="Times New Roman"/>
-          <w:i/>
-          <w:iCs/>
-          <w:color w:val="C00000"/>
-          <w:sz w:val="24"/>
-        </w:rPr>
-        <w:t>Thread</w:t>
-      </w:r>
-      <w:r>
-        <w:rPr>
-          <w:rFonts w:ascii="Times New Roman" w:hAnsi="Times New Roman" w:cs="Times New Roman"/>
-          <w:i/>
-          <w:iCs/>
-          <w:color w:val="C00000"/>
-          <w:sz w:val="24"/>
-          <w:lang w:val="ru-RU"/>
-        </w:rPr>
-        <w:t xml:space="preserve"> </w:t>
-      </w:r>
-      <w:r>
-        <w:rPr>
-          <w:rFonts w:ascii="Times New Roman" w:hAnsi="Times New Roman" w:cs="Times New Roman"/>
-          <w:i/>
-          <w:iCs/>
-          <w:color w:val="C00000"/>
-          <w:sz w:val="24"/>
-        </w:rPr>
-        <w:t>Group</w:t>
-      </w:r>
-      <w:r>
-        <w:rPr>
-          <w:rFonts w:ascii="Times New Roman" w:hAnsi="Times New Roman" w:cs="Times New Roman"/>
-          <w:i/>
-          <w:iCs/>
-          <w:color w:val="C00000"/>
-          <w:sz w:val="24"/>
-          <w:lang w:val="ru-RU"/>
-        </w:rPr>
-        <w:t xml:space="preserve"> для </w:t>
-      </w:r>
-      <w:proofErr w:type="spellStart"/>
-      <w:r>
-        <w:rPr>
-          <w:rFonts w:ascii="Times New Roman" w:hAnsi="Times New Roman" w:cs="Times New Roman"/>
-          <w:i/>
-          <w:iCs/>
-          <w:color w:val="C00000"/>
-          <w:sz w:val="24"/>
-        </w:rPr>
-        <w:t>Exp</w:t>
-      </w:r>
-      <w:proofErr w:type="spellEnd"/>
-      <w:r>
-        <w:rPr>
-          <w:rFonts w:ascii="Times New Roman" w:hAnsi="Times New Roman" w:cs="Times New Roman"/>
-          <w:i/>
-          <w:iCs/>
-          <w:color w:val="C00000"/>
-          <w:sz w:val="24"/>
-          <w:lang w:val="ru-RU"/>
-        </w:rPr>
-        <w:t>2]</w:t>
-      </w:r>
-    </w:p>
-    <w:p>
-      <w:pPr>
-        <w:spacing w:after="200"/>
-        <w:rPr>
-          <w:rFonts w:ascii="Times New Roman" w:hAnsi="Times New Roman" w:cs="Times New Roman"/>
-          <w:sz w:val="24"/>
-        </w:rPr>
-      </w:pPr>
-      <w:r>
-        <w:rPr>
-          <w:rFonts w:ascii="Times New Roman" w:hAnsi="Times New Roman" w:cs="Times New Roman"/>
-          <w:i/>
-          <w:iCs/>
-          <w:color w:val="C00000"/>
-          <w:sz w:val="24"/>
-        </w:rPr>
-        <w:t xml:space="preserve">[ЗАПОЛНИТЬ: </w:t>
-      </w:r>
-      <w:proofErr w:type="spellStart"/>
-      <w:r>
-        <w:rPr>
-          <w:rFonts w:ascii="Times New Roman" w:hAnsi="Times New Roman" w:cs="Times New Roman"/>
-          <w:i/>
-          <w:iCs/>
-          <w:color w:val="C00000"/>
-          <w:sz w:val="24"/>
-        </w:rPr>
-        <w:t>диаграмма</w:t>
-      </w:r>
-      <w:proofErr w:type="spellEnd"/>
-      <w:r>
-        <w:rPr>
-          <w:rFonts w:ascii="Times New Roman" w:hAnsi="Times New Roman" w:cs="Times New Roman"/>
-          <w:i/>
-          <w:iCs/>
-          <w:color w:val="C00000"/>
-          <w:sz w:val="24"/>
-        </w:rPr>
-        <w:t xml:space="preserve"> Requests Summary (PASS/FAIL) </w:t>
-      </w:r>
-      <w:proofErr w:type="spellStart"/>
-      <w:r>
-        <w:rPr>
-          <w:rFonts w:ascii="Times New Roman" w:hAnsi="Times New Roman" w:cs="Times New Roman"/>
-          <w:i/>
-          <w:iCs/>
-          <w:color w:val="C00000"/>
-          <w:sz w:val="24"/>
-        </w:rPr>
-        <w:t>для</w:t>
-      </w:r>
-      <w:proofErr w:type="spellEnd"/>
-      <w:r>
-        <w:rPr>
-          <w:rFonts w:ascii="Times New Roman" w:hAnsi="Times New Roman" w:cs="Times New Roman"/>
-          <w:i/>
-          <w:iCs/>
-          <w:color w:val="C00000"/>
-          <w:sz w:val="24"/>
-        </w:rPr>
-        <w:t xml:space="preserve"> Exp2]</w:t>
-      </w:r>
-    </w:p>
-    <w:p>
-      <w:pPr>
-        <w:spacing w:after="200"/>
-        <w:rPr>
-          <w:rFonts w:ascii="Times New Roman" w:hAnsi="Times New Roman" w:cs="Times New Roman"/>
-          <w:sz w:val="24"/>
-          <w:lang w:val="ru-RU"/>
-        </w:rPr>
-      </w:pPr>
-      <w:r>
-        <w:rPr>
-          <w:rFonts w:ascii="Times New Roman" w:hAnsi="Times New Roman" w:cs="Times New Roman"/>
-          <w:i/>
-          <w:iCs/>
-          <w:color w:val="C00000"/>
-          <w:sz w:val="24"/>
-          <w:lang w:val="ru-RU"/>
-        </w:rPr>
-        <w:t xml:space="preserve">[ЗАПОЛНИТЬ: таблица </w:t>
-      </w:r>
-      <w:r>
-        <w:rPr>
-          <w:rFonts w:ascii="Times New Roman" w:hAnsi="Times New Roman" w:cs="Times New Roman"/>
-          <w:i/>
-          <w:iCs/>
-          <w:color w:val="C00000"/>
-          <w:sz w:val="24"/>
-        </w:rPr>
-        <w:t>Errors</w:t>
-      </w:r>
-      <w:r>
-        <w:rPr>
-          <w:rFonts w:ascii="Times New Roman" w:hAnsi="Times New Roman" w:cs="Times New Roman"/>
-          <w:i/>
-          <w:iCs/>
-          <w:color w:val="C00000"/>
-          <w:sz w:val="24"/>
-          <w:lang w:val="ru-RU"/>
-        </w:rPr>
-        <w:t xml:space="preserve"> (по типам: 500, 503, </w:t>
-      </w:r>
-      <w:r>
-        <w:rPr>
-          <w:rFonts w:ascii="Times New Roman" w:hAnsi="Times New Roman" w:cs="Times New Roman"/>
-          <w:i/>
-          <w:iCs/>
-          <w:color w:val="C00000"/>
-          <w:sz w:val="24"/>
-        </w:rPr>
-        <w:t>no</w:t>
-      </w:r>
-      <w:r>
-        <w:rPr>
-          <w:rFonts w:ascii="Times New Roman" w:hAnsi="Times New Roman" w:cs="Times New Roman"/>
-          <w:i/>
-          <w:iCs/>
-          <w:color w:val="C00000"/>
-          <w:sz w:val="24"/>
-          <w:lang w:val="ru-RU"/>
-        </w:rPr>
-        <w:t xml:space="preserve"> </w:t>
-      </w:r>
-      <w:r>
-        <w:rPr>
-          <w:rFonts w:ascii="Times New Roman" w:hAnsi="Times New Roman" w:cs="Times New Roman"/>
-          <w:i/>
-          <w:iCs/>
-          <w:color w:val="C00000"/>
-          <w:sz w:val="24"/>
-        </w:rPr>
-        <w:t>response</w:t>
-      </w:r>
-      <w:r>
-        <w:rPr>
-          <w:rFonts w:ascii="Times New Roman" w:hAnsi="Times New Roman" w:cs="Times New Roman"/>
-          <w:i/>
-          <w:iCs/>
-          <w:color w:val="C00000"/>
-          <w:sz w:val="24"/>
-          <w:lang w:val="ru-RU"/>
-        </w:rPr>
-        <w:t xml:space="preserve">) для </w:t>
-      </w:r>
-      <w:proofErr w:type="spellStart"/>
-      <w:r>
-        <w:rPr>
-          <w:rFonts w:ascii="Times New Roman" w:hAnsi="Times New Roman" w:cs="Times New Roman"/>
-          <w:i/>
-          <w:iCs/>
-          <w:color w:val="C00000"/>
-          <w:sz w:val="24"/>
-        </w:rPr>
-        <w:t>Exp</w:t>
-      </w:r>
-      <w:proofErr w:type="spellEnd"/>
-      <w:r>
-        <w:rPr>
-          <w:rFonts w:ascii="Times New Roman" w:hAnsi="Times New Roman" w:cs="Times New Roman"/>
-          <w:i/>
-          <w:iCs/>
-          <w:color w:val="C00000"/>
-          <w:sz w:val="24"/>
-          <w:lang w:val="ru-RU"/>
-        </w:rPr>
-        <w:t>2]</w:t>
-      </w:r>
-    </w:p>
-    <w:p>
-      <w:pPr>
-        <w:spacing w:after="200"/>
-        <w:rPr>
-          <w:rFonts w:ascii="Times New Roman" w:hAnsi="Times New Roman" w:cs="Times New Roman"/>
-          <w:sz w:val="24"/>
-        </w:rPr>
-      </w:pPr>
-      <w:r>
-        <w:rPr>
-          <w:rFonts w:ascii="Times New Roman" w:hAnsi="Times New Roman" w:cs="Times New Roman"/>
-          <w:i/>
-          <w:iCs/>
-          <w:color w:val="C00000"/>
-          <w:sz w:val="24"/>
-        </w:rPr>
-        <w:t xml:space="preserve">[ЗАПОЛНИТЬ: </w:t>
-      </w:r>
-      <w:proofErr w:type="spellStart"/>
-      <w:r>
-        <w:rPr>
-          <w:rFonts w:ascii="Times New Roman" w:hAnsi="Times New Roman" w:cs="Times New Roman"/>
-          <w:i/>
-          <w:iCs/>
-          <w:color w:val="C00000"/>
-          <w:sz w:val="24"/>
-        </w:rPr>
-        <w:t>график</w:t>
-      </w:r>
-      <w:proofErr w:type="spellEnd"/>
-      <w:r>
-        <w:rPr>
-          <w:rFonts w:ascii="Times New Roman" w:hAnsi="Times New Roman" w:cs="Times New Roman"/>
-          <w:i/>
-          <w:iCs/>
-          <w:color w:val="C00000"/>
-          <w:sz w:val="24"/>
-        </w:rPr>
-        <w:t xml:space="preserve"> Active Threads </w:t>
-      </w:r>
-      <w:proofErr w:type="gramStart"/>
-      <w:r>
-        <w:rPr>
-          <w:rFonts w:ascii="Times New Roman" w:hAnsi="Times New Roman" w:cs="Times New Roman"/>
-          <w:i/>
-          <w:iCs/>
-          <w:color w:val="C00000"/>
-          <w:sz w:val="24"/>
-        </w:rPr>
-        <w:t>Over</w:t>
-      </w:r>
-      <w:proofErr w:type="gramEnd"/>
-      <w:r>
-        <w:rPr>
-          <w:rFonts w:ascii="Times New Roman" w:hAnsi="Times New Roman" w:cs="Times New Roman"/>
-          <w:i/>
-          <w:iCs/>
-          <w:color w:val="C00000"/>
-          <w:sz w:val="24"/>
-        </w:rPr>
-        <w:t xml:space="preserve"> Time </w:t>
-      </w:r>
-      <w:proofErr w:type="spellStart"/>
-      <w:r>
-        <w:rPr>
-          <w:rFonts w:ascii="Times New Roman" w:hAnsi="Times New Roman" w:cs="Times New Roman"/>
-          <w:i/>
-          <w:iCs/>
-          <w:color w:val="C00000"/>
-          <w:sz w:val="24"/>
-        </w:rPr>
-        <w:t>для</w:t>
-      </w:r>
-      <w:proofErr w:type="spellEnd"/>
-      <w:r>
-        <w:rPr>
-          <w:rFonts w:ascii="Times New Roman" w:hAnsi="Times New Roman" w:cs="Times New Roman"/>
-          <w:i/>
-          <w:iCs/>
-          <w:color w:val="C00000"/>
-          <w:sz w:val="24"/>
-        </w:rPr>
-        <w:t xml:space="preserve"> Exp2]</w:t>
-      </w:r>
-    </w:p>
-    <w:p>
-      <w:pPr>
-        <w:spacing w:after="200"/>
-        <w:rPr>
-          <w:rFonts w:ascii="Times New Roman" w:hAnsi="Times New Roman" w:cs="Times New Roman"/>
-          <w:sz w:val="24"/>
-          <w:lang w:val="ru-RU"/>
-        </w:rPr>
-      </w:pPr>
-      <w:r>
-        <w:rPr>
-          <w:rFonts w:ascii="Times New Roman" w:hAnsi="Times New Roman" w:cs="Times New Roman"/>
-          <w:i/>
-          <w:iCs/>
-          <w:color w:val="C00000"/>
-          <w:sz w:val="24"/>
-          <w:lang w:val="ru-RU"/>
-        </w:rPr>
-        <w:t xml:space="preserve">[ЗАПОЛНИТЬ: график </w:t>
-      </w:r>
-      <w:r>
-        <w:rPr>
-          <w:rFonts w:ascii="Times New Roman" w:hAnsi="Times New Roman" w:cs="Times New Roman"/>
-          <w:i/>
-          <w:iCs/>
-          <w:color w:val="C00000"/>
-          <w:sz w:val="24"/>
-        </w:rPr>
-        <w:t>Codes</w:t>
-      </w:r>
-      <w:r>
-        <w:rPr>
-          <w:rFonts w:ascii="Times New Roman" w:hAnsi="Times New Roman" w:cs="Times New Roman"/>
-          <w:i/>
-          <w:iCs/>
-          <w:color w:val="C00000"/>
-          <w:sz w:val="24"/>
-          <w:lang w:val="ru-RU"/>
-        </w:rPr>
-        <w:t xml:space="preserve"> </w:t>
-      </w:r>
-      <w:r>
-        <w:rPr>
-          <w:rFonts w:ascii="Times New Roman" w:hAnsi="Times New Roman" w:cs="Times New Roman"/>
-          <w:i/>
-          <w:iCs/>
-          <w:color w:val="C00000"/>
-          <w:sz w:val="24"/>
-        </w:rPr>
-        <w:t>Per</w:t>
-      </w:r>
-      <w:r>
-        <w:rPr>
-          <w:rFonts w:ascii="Times New Roman" w:hAnsi="Times New Roman" w:cs="Times New Roman"/>
-          <w:i/>
-          <w:iCs/>
-          <w:color w:val="C00000"/>
-          <w:sz w:val="24"/>
-          <w:lang w:val="ru-RU"/>
-        </w:rPr>
-        <w:t xml:space="preserve"> </w:t>
-      </w:r>
-      <w:r>
-        <w:rPr>
-          <w:rFonts w:ascii="Times New Roman" w:hAnsi="Times New Roman" w:cs="Times New Roman"/>
-          <w:i/>
-          <w:iCs/>
-          <w:color w:val="C00000"/>
-          <w:sz w:val="24"/>
-        </w:rPr>
-        <w:t>Second</w:t>
-      </w:r>
-      <w:r>
-        <w:rPr>
-          <w:rFonts w:ascii="Times New Roman" w:hAnsi="Times New Roman" w:cs="Times New Roman"/>
-          <w:i/>
-          <w:iCs/>
-          <w:color w:val="C00000"/>
-          <w:sz w:val="24"/>
-          <w:lang w:val="ru-RU"/>
-        </w:rPr>
-        <w:t xml:space="preserve"> (200/500/503) для </w:t>
-      </w:r>
-      <w:proofErr w:type="spellStart"/>
-      <w:r>
-        <w:rPr>
-          <w:rFonts w:ascii="Times New Roman" w:hAnsi="Times New Roman" w:cs="Times New Roman"/>
-          <w:i/>
-          <w:iCs/>
-          <w:color w:val="C00000"/>
-          <w:sz w:val="24"/>
-        </w:rPr>
-        <w:t>Exp</w:t>
-      </w:r>
-      <w:proofErr w:type="spellEnd"/>
-      <w:r>
-        <w:rPr>
-          <w:rFonts w:ascii="Times New Roman" w:hAnsi="Times New Roman" w:cs="Times New Roman"/>
-          <w:i/>
-          <w:iCs/>
-          <w:color w:val="C00000"/>
-          <w:sz w:val="24"/>
-          <w:lang w:val="ru-RU"/>
-        </w:rPr>
-        <w:t>2 — момент появления первого 503]</w:t>
-      </w:r>
-    </w:p>
-    <w:p>
-      <w:pPr>
-        <w:pStyle w:val="Heading2"/>
-        <w:spacing w:before="280" w:after="160"/>
-        <w:rPr>
-          <w:rFonts w:ascii="Times New Roman" w:hAnsi="Times New Roman" w:cs="Times New Roman"/>
-          <w:sz w:val="36"/>
-          <w:lang w:val="ru-RU"/>
-        </w:rPr>
-      </w:pPr>
       <w:r>
         <w:rPr>
           <w:rFonts w:ascii="Times New Roman" w:hAnsi="Times New Roman" w:cs="Times New Roman"/>
@@ -6853,6 +6305,7 @@
   <w:style w:type="character" w:default="1" w:styleId="DefaultParagraphFont">
     <w:name w:val="Default Paragraph Font"/>
     <w:uiPriority w:val="1"/>
+    <w:semiHidden/>
     <w:unhideWhenUsed/>
   </w:style>
   <w:style w:type="table" w:default="1" w:styleId="TableNormal">
@@ -7560,7 +7013,7 @@
 </file>
 
 <file path=customXml/itemProps1.xml><?xml version="1.0" encoding="utf-8"?>
-<ds:datastoreItem xmlns:ds="http://schemas.openxmlformats.org/officeDocument/2006/customXml" ds:itemID="{FEE11C2D-4BF2-4F7B-94CD-8A4BA9E5F86D}">
+<ds:datastoreItem xmlns:ds="http://schemas.openxmlformats.org/officeDocument/2006/customXml" ds:itemID="{EEDE7C9D-FB2E-4C0C-B64B-8DB20D8AD952}">
   <ds:schemaRefs>
     <ds:schemaRef ds:uri="http://schemas.openxmlformats.org/officeDocument/2006/bibliography"/>
   </ds:schemaRefs>

</xml_diff>

<commit_message>
feat: add report for stress, docx
</commit_message>
<xml_diff>
--- a/Lab4/lab4.docx
+++ b/Lab4/lab4.docx
@@ -4063,7 +4063,28 @@
           <w:szCs w:val="22"/>
           <w:lang w:val="ru-RU"/>
         </w:rPr>
-        <w:t>В ходе стресс-тестирования HTTP 503 не был зафиксирован вплоть до 224 пользователей. Однако уже при нагрузке 32 пользователя (640 запросов/мин) среднее время ответа превысило 620 мс (621 мс), а доля ошибок достигла 49%. При нагрузке 40 пользователей (800 запросов/мин) среднее время ответа составило 660 мс, а доля ошибок — 91%. Это свидетельствует о превышении предельной нагрузки. Сервер возвращал ошибки, отличные от 503 (вероятно, HTTP 500 или таймауты), что может быть связано с особенностями конфигурации приложения</w:t>
+        <w:lastRenderedPageBreak/>
+        <w:t>В ходе стресс-тестирования HTTP 503 не был зафиксирован вплоть до 224 пользователей. Однако уже при нагрузке 32 пользователя (640 запросов/мин) среднее время ответа превысило 620 мс (621 мс), а доля ошибок достигла 49%. При нагрузке 40 пользователей (800 запросов/мин) среднее время ответа составило</w:t>
+      </w:r>
+      <w:r>
+        <w:rPr>
+          <w:rFonts w:ascii="Times New Roman" w:eastAsiaTheme="minorHAnsi" w:hAnsi="Times New Roman" w:cs="Times New Roman"/>
+          <w:color w:val="auto"/>
+          <w:sz w:val="24"/>
+          <w:szCs w:val="22"/>
+          <w:lang w:val="ru-RU"/>
+        </w:rPr>
+        <w:t xml:space="preserve"> примерно</w:t>
+      </w:r>
+      <w:r>
+        <w:rPr>
+          <w:rFonts w:ascii="Times New Roman" w:eastAsiaTheme="minorHAnsi" w:hAnsi="Times New Roman" w:cs="Times New Roman"/>
+          <w:color w:val="auto"/>
+          <w:sz w:val="24"/>
+          <w:szCs w:val="22"/>
+          <w:lang w:val="ru-RU"/>
+        </w:rPr>
+        <w:t xml:space="preserve"> 660 мс, а доля ошибок — 91%. Это свидетельствует о превышении предельной нагрузки. Сервер возвращал ошибки, отличные от 503 (вероятно, HTTP 500 или таймауты), что может быть связано с особенностями конфигурации приложения</w:t>
       </w:r>
     </w:p>
     <w:p>
@@ -4076,196 +4097,156 @@
           <w:lang w:val="ru-RU"/>
         </w:rPr>
       </w:pPr>
+      <w:r>
+        <w:rPr>
+          <w:rFonts w:ascii="Times New Roman" w:hAnsi="Times New Roman" w:cs="Times New Roman"/>
+          <w:sz w:val="36"/>
+          <w:lang w:val="ru-RU"/>
+        </w:rPr>
+        <w:t>График</w:t>
+      </w:r>
+      <w:r>
+        <w:rPr>
+          <w:rFonts w:ascii="Times New Roman" w:hAnsi="Times New Roman" w:cs="Times New Roman"/>
+          <w:sz w:val="36"/>
+          <w:lang w:val="ru-RU"/>
+        </w:rPr>
+        <w:t>и</w:t>
+      </w:r>
+      <w:r>
+        <w:rPr>
+          <w:rFonts w:ascii="Times New Roman" w:hAnsi="Times New Roman" w:cs="Times New Roman"/>
+          <w:sz w:val="36"/>
+          <w:lang w:val="ru-RU"/>
+        </w:rPr>
+        <w:t xml:space="preserve"> для выбранной конфигурации</w:t>
+      </w:r>
+    </w:p>
+    <w:p>
+      <w:pPr>
+        <w:pStyle w:val="Heading1"/>
+        <w:spacing w:before="280" w:after="160"/>
+        <w:rPr>
+          <w:rFonts w:ascii="Times New Roman" w:hAnsi="Times New Roman" w:cs="Times New Roman"/>
+          <w:sz w:val="44"/>
+        </w:rPr>
+      </w:pPr>
+      <w:r>
+        <w:rPr>
+          <w:rFonts w:ascii="Times New Roman" w:hAnsi="Times New Roman" w:cs="Times New Roman"/>
+          <w:sz w:val="44"/>
+        </w:rPr>
+        <w:lastRenderedPageBreak/>
+        <w:pict w14:anchorId="086727CE">
+          <v:shape id="_x0000_i1035" type="#_x0000_t75" style="width:306pt;height:171.6pt">
+            <v:imagedata r:id="rId31" o:title="until_503_error_rate_vs_users"/>
+          </v:shape>
+        </w:pict>
+      </w:r>
+      <w:r>
+        <w:rPr>
+          <w:rFonts w:ascii="Times New Roman" w:hAnsi="Times New Roman" w:cs="Times New Roman"/>
+          <w:sz w:val="44"/>
+        </w:rPr>
+        <w:pict w14:anchorId="20375073">
+          <v:shape id="_x0000_i1036" type="#_x0000_t75" style="width:297.6pt;height:166.8pt">
+            <v:imagedata r:id="rId32" o:title="until_503_http_503_count_vs_users"/>
+          </v:shape>
+        </w:pict>
+      </w:r>
+      <w:r>
+        <w:rPr>
+          <w:rFonts w:ascii="Times New Roman" w:hAnsi="Times New Roman" w:cs="Times New Roman"/>
+          <w:sz w:val="44"/>
+        </w:rPr>
+        <w:pict w14:anchorId="02BD6608">
+          <v:shape id="_x0000_i1037" type="#_x0000_t75" style="width:309pt;height:173.4pt">
+            <v:imagedata r:id="rId33" o:title="until_503_response_time_vs_users"/>
+          </v:shape>
+        </w:pict>
+      </w:r>
+      <w:r>
+        <w:rPr>
+          <w:rFonts w:ascii="Times New Roman" w:hAnsi="Times New Roman" w:cs="Times New Roman"/>
+          <w:sz w:val="44"/>
+        </w:rPr>
+        <w:pict w14:anchorId="0EA55C6F">
+          <v:shape id="_x0000_i1038" type="#_x0000_t75" style="width:301.8pt;height:169.2pt">
+            <v:imagedata r:id="rId34" o:title="until_503_throughput_rpm_vs_users"/>
+          </v:shape>
+        </w:pict>
+      </w:r>
+    </w:p>
+    <w:p>
+      <w:pPr>
+        <w:pStyle w:val="Heading1"/>
+        <w:spacing w:before="280" w:after="160"/>
+        <w:rPr>
+          <w:rFonts w:ascii="Times New Roman" w:hAnsi="Times New Roman" w:cs="Times New Roman"/>
+          <w:sz w:val="44"/>
+          <w:lang w:val="ru-RU"/>
+        </w:rPr>
+      </w:pPr>
+      <w:r>
+        <w:rPr>
+          <w:rFonts w:ascii="Times New Roman" w:hAnsi="Times New Roman" w:cs="Times New Roman"/>
+          <w:sz w:val="44"/>
+          <w:lang w:val="ru-RU"/>
+        </w:rPr>
+        <w:lastRenderedPageBreak/>
+        <w:t>Выводы по работе</w:t>
+      </w:r>
+    </w:p>
+    <w:p>
+      <w:pPr>
+        <w:rPr>
+          <w:rFonts w:ascii="Times New Roman" w:hAnsi="Times New Roman" w:cs="Times New Roman"/>
+          <w:sz w:val="24"/>
+          <w:lang w:val="ru-RU"/>
+        </w:rPr>
+      </w:pPr>
+      <w:r>
+        <w:rPr>
+          <w:rFonts w:ascii="Times New Roman" w:hAnsi="Times New Roman" w:cs="Times New Roman"/>
+          <w:sz w:val="24"/>
+          <w:lang w:val="ru-RU"/>
+        </w:rPr>
+        <w:t xml:space="preserve">В ходе выполнения лабораторной работы были изучены методы нагрузочного и стресс-тестирования веб-приложений с использованием программного пакета </w:t>
+      </w:r>
+      <w:r>
+        <w:rPr>
+          <w:rFonts w:ascii="Times New Roman" w:hAnsi="Times New Roman" w:cs="Times New Roman"/>
+          <w:sz w:val="24"/>
+        </w:rPr>
+        <w:t>Apache</w:t>
+      </w:r>
+      <w:r>
+        <w:rPr>
+          <w:rFonts w:ascii="Times New Roman" w:hAnsi="Times New Roman" w:cs="Times New Roman"/>
+          <w:sz w:val="24"/>
+          <w:lang w:val="ru-RU"/>
+        </w:rPr>
+        <w:t xml:space="preserve"> </w:t>
+      </w:r>
+      <w:proofErr w:type="spellStart"/>
+      <w:r>
+        <w:rPr>
+          <w:rFonts w:ascii="Times New Roman" w:hAnsi="Times New Roman" w:cs="Times New Roman"/>
+          <w:sz w:val="24"/>
+        </w:rPr>
+        <w:t>JMeter</w:t>
+      </w:r>
+      <w:proofErr w:type="spellEnd"/>
+      <w:r>
+        <w:rPr>
+          <w:rFonts w:ascii="Times New Roman" w:hAnsi="Times New Roman" w:cs="Times New Roman"/>
+          <w:sz w:val="24"/>
+          <w:lang w:val="ru-RU"/>
+        </w:rPr>
+        <w:t>. Были настроены сценарии тестирования, выполнена генерация нагрузки и проведён анализ основных показателей производительности системы.</w:t>
+      </w:r>
       <w:bookmarkStart w:id="0" w:name="_GoBack"/>
       <w:bookmarkEnd w:id="0"/>
-      <w:r>
-        <w:rPr>
-          <w:rFonts w:ascii="Times New Roman" w:hAnsi="Times New Roman" w:cs="Times New Roman"/>
-          <w:sz w:val="36"/>
-          <w:lang w:val="ru-RU"/>
-        </w:rPr>
-        <w:t>График изменения времени отклика от нагрузки для выбранной конфигурации</w:t>
-      </w:r>
-    </w:p>
-    <w:p>
-      <w:pPr>
-        <w:spacing w:after="200"/>
-        <w:rPr>
-          <w:rFonts w:ascii="Times New Roman" w:hAnsi="Times New Roman" w:cs="Times New Roman"/>
-          <w:sz w:val="24"/>
-          <w:lang w:val="ru-RU"/>
-        </w:rPr>
-      </w:pPr>
-      <w:r>
-        <w:rPr>
-          <w:rFonts w:ascii="Times New Roman" w:hAnsi="Times New Roman" w:cs="Times New Roman"/>
-          <w:i/>
-          <w:iCs/>
-          <w:color w:val="C00000"/>
-          <w:sz w:val="24"/>
-          <w:lang w:val="ru-RU"/>
-        </w:rPr>
-        <w:t>[ЗАПОЛНИТЬ: итоговый график зависимости времени отклика от нагрузки (</w:t>
-      </w:r>
-      <w:r>
-        <w:rPr>
-          <w:rFonts w:ascii="Times New Roman" w:hAnsi="Times New Roman" w:cs="Times New Roman"/>
-          <w:i/>
-          <w:iCs/>
-          <w:color w:val="C00000"/>
-          <w:sz w:val="24"/>
-        </w:rPr>
-        <w:t>RPS</w:t>
-      </w:r>
-      <w:r>
-        <w:rPr>
-          <w:rFonts w:ascii="Times New Roman" w:hAnsi="Times New Roman" w:cs="Times New Roman"/>
-          <w:i/>
-          <w:iCs/>
-          <w:color w:val="C00000"/>
-          <w:sz w:val="24"/>
-          <w:lang w:val="ru-RU"/>
-        </w:rPr>
-        <w:t>/число пользователей) — собрать по данным Эксперимента 1]</w:t>
-      </w:r>
-    </w:p>
-    <w:p>
-      <w:pPr>
-        <w:pStyle w:val="Heading1"/>
-        <w:spacing w:before="280" w:after="160"/>
-        <w:rPr>
-          <w:rFonts w:ascii="Times New Roman" w:hAnsi="Times New Roman" w:cs="Times New Roman"/>
-          <w:sz w:val="44"/>
-          <w:lang w:val="ru-RU"/>
-        </w:rPr>
-      </w:pPr>
-      <w:r>
-        <w:rPr>
-          <w:rFonts w:ascii="Times New Roman" w:hAnsi="Times New Roman" w:cs="Times New Roman"/>
-          <w:sz w:val="44"/>
-          <w:lang w:val="ru-RU"/>
-        </w:rPr>
-        <w:t>Выводы по работе</w:t>
-      </w:r>
-    </w:p>
-    <w:p>
-      <w:pPr>
-        <w:rPr>
-          <w:rFonts w:ascii="Times New Roman" w:hAnsi="Times New Roman" w:cs="Times New Roman"/>
-          <w:sz w:val="24"/>
-          <w:lang w:val="ru-RU"/>
-        </w:rPr>
-      </w:pPr>
-      <w:r>
-        <w:rPr>
-          <w:rFonts w:ascii="Times New Roman" w:hAnsi="Times New Roman" w:cs="Times New Roman"/>
-          <w:sz w:val="24"/>
-          <w:lang w:val="ru-RU"/>
-        </w:rPr>
-        <w:t xml:space="preserve">В ходе выполнения лабораторной работы были изучены методы нагрузочного и стресс-тестирования веб-приложений с использованием программного пакета </w:t>
-      </w:r>
-      <w:r>
-        <w:rPr>
-          <w:rFonts w:ascii="Times New Roman" w:hAnsi="Times New Roman" w:cs="Times New Roman"/>
-          <w:sz w:val="24"/>
-        </w:rPr>
-        <w:t>Apache</w:t>
-      </w:r>
-      <w:r>
-        <w:rPr>
-          <w:rFonts w:ascii="Times New Roman" w:hAnsi="Times New Roman" w:cs="Times New Roman"/>
-          <w:sz w:val="24"/>
-          <w:lang w:val="ru-RU"/>
-        </w:rPr>
-        <w:t xml:space="preserve"> </w:t>
-      </w:r>
-      <w:proofErr w:type="spellStart"/>
-      <w:r>
-        <w:rPr>
-          <w:rFonts w:ascii="Times New Roman" w:hAnsi="Times New Roman" w:cs="Times New Roman"/>
-          <w:sz w:val="24"/>
-        </w:rPr>
-        <w:t>JMeter</w:t>
-      </w:r>
-      <w:proofErr w:type="spellEnd"/>
-      <w:r>
-        <w:rPr>
-          <w:rFonts w:ascii="Times New Roman" w:hAnsi="Times New Roman" w:cs="Times New Roman"/>
-          <w:sz w:val="24"/>
-          <w:lang w:val="ru-RU"/>
-        </w:rPr>
-        <w:t>. Были настроены сценарии тестирования, выполнена генерация нагрузки и проведён анализ основных показателей производительности системы.</w:t>
-      </w:r>
-    </w:p>
-    <w:p>
-      <w:pPr>
-        <w:spacing w:after="200"/>
-        <w:rPr>
-          <w:rFonts w:ascii="Times New Roman" w:hAnsi="Times New Roman" w:cs="Times New Roman"/>
-          <w:sz w:val="24"/>
-          <w:lang w:val="ru-RU"/>
-        </w:rPr>
-      </w:pPr>
-      <w:r>
-        <w:rPr>
-          <w:rFonts w:ascii="Times New Roman" w:hAnsi="Times New Roman" w:cs="Times New Roman"/>
-          <w:i/>
-          <w:iCs/>
-          <w:color w:val="C00000"/>
-          <w:sz w:val="24"/>
-          <w:lang w:val="ru-RU"/>
-        </w:rPr>
-        <w:t>[ЗАПОЛНИТЬ: итоговый вывод: какая конфигурация выбрана, на каком количестве пользователей/</w:t>
-      </w:r>
-      <w:r>
-        <w:rPr>
-          <w:rFonts w:ascii="Times New Roman" w:hAnsi="Times New Roman" w:cs="Times New Roman"/>
-          <w:i/>
-          <w:iCs/>
-          <w:color w:val="C00000"/>
-          <w:sz w:val="24"/>
-        </w:rPr>
-        <w:t>RPS</w:t>
-      </w:r>
-      <w:r>
-        <w:rPr>
-          <w:rFonts w:ascii="Times New Roman" w:hAnsi="Times New Roman" w:cs="Times New Roman"/>
-          <w:i/>
-          <w:iCs/>
-          <w:color w:val="C00000"/>
-          <w:sz w:val="24"/>
-          <w:lang w:val="ru-RU"/>
-        </w:rPr>
-        <w:t xml:space="preserve"> наступает деградация и отказ (503), сколько это в реальных цифрах по вашему прогону]</w:t>
-      </w:r>
-    </w:p>
-    <w:p>
-      <w:pPr>
-        <w:rPr>
-          <w:rFonts w:ascii="Times New Roman" w:hAnsi="Times New Roman" w:cs="Times New Roman"/>
-          <w:sz w:val="24"/>
-          <w:lang w:val="ru-RU"/>
-        </w:rPr>
-      </w:pPr>
-      <w:r>
-        <w:rPr>
-          <w:rFonts w:ascii="Times New Roman" w:hAnsi="Times New Roman" w:cs="Times New Roman"/>
-          <w:sz w:val="24"/>
-          <w:lang w:val="ru-RU"/>
-        </w:rPr>
-        <w:br w:type="page"/>
-      </w:r>
-    </w:p>
-    <w:p>
-      <w:pPr>
-        <w:jc w:val="center"/>
-        <w:rPr>
-          <w:rFonts w:ascii="Times New Roman" w:hAnsi="Times New Roman" w:cs="Times New Roman"/>
-          <w:sz w:val="28"/>
-          <w:szCs w:val="24"/>
-          <w:lang w:val="ru-RU"/>
-        </w:rPr>
-      </w:pPr>
     </w:p>
     <w:sectPr>
       <w:pgSz w:w="11906" w:h="16838"/>
@@ -7013,7 +6994,7 @@
 </file>
 
 <file path=customXml/itemProps1.xml><?xml version="1.0" encoding="utf-8"?>
-<ds:datastoreItem xmlns:ds="http://schemas.openxmlformats.org/officeDocument/2006/customXml" ds:itemID="{EEDE7C9D-FB2E-4C0C-B64B-8DB20D8AD952}">
+<ds:datastoreItem xmlns:ds="http://schemas.openxmlformats.org/officeDocument/2006/customXml" ds:itemID="{70A6E641-C1CB-4A80-A92D-81163A14D992}">
   <ds:schemaRefs>
     <ds:schemaRef ds:uri="http://schemas.openxmlformats.org/officeDocument/2006/bibliography"/>
   </ds:schemaRefs>

</xml_diff>